<commit_message>
Season Two bible: update from Episode 8 canon
Co-Authored-By: Claude Sonnet 5.5 <noreply@anthropic.com>
Claude-Session: https://claude.ai/code/session_01XPtFq9do9pJBskMEWLEohm
</commit_message>
<xml_diff>
--- a/Legacy_Admission_Season2_Bible.docx
+++ b/Legacy_Admission_Season2_Bible.docx
@@ -61,7 +61,7 @@
           <w:sz w:val="20"/>
           <w:szCs w:val="20"/>
         </w:rPr>
-        <w:t xml:space="preserve">DRAFT 1 — built from the locked Season One save (Episodes 1–7 verified, Episode 8 pending)</w:t>
+        <w:t xml:space="preserve">DRAFT 2 — built from your locked Season One save (Episodes 1–8, all canon)</w:t>
       </w:r>
     </w:p>
     <w:p>
@@ -503,7 +503,7 @@
           <w:sz w:val="22"/>
           <w:szCs w:val="22"/>
         </w:rPr>
-        <w:t xml:space="preserve">Summary of the Season One position. Details marked pending depend on how Episode 8 is played, and I will adjust from the locked Episode 8 save.</w:t>
+        <w:t xml:space="preserve">Your locked Season One save, Episodes 1–8. These are the choices that carry forward.</w:t>
       </w:r>
     </w:p>
     <w:tbl>
@@ -645,7 +645,7 @@
                 <w:sz w:val="19"/>
                 <w:szCs w:val="19"/>
               </w:rPr>
-              <w:t xml:space="preserve">Sober or almost; has said what he saw, in public. Nerve 1. Reputation strained. A hearing Thursday. Carrying a napkin with “I L—” and, depending on Episode 8, a kiss from Josie.</w:t>
+              <w:t xml:space="preserve">Said what he saw, in public. Took a pill in Morrow, told Del the truth, and spoke at his first Tuesday meeting (“My name’s Theo. I took a pill on Friday”); a few days sober at the finale and carrying a napkin with “I L—.” Charm 25, Heart 65, Wit 16, Nerve 1. Heart is his defining stat; Nerve is the hole the season fills. Campus reputation +10, town 0. Spoke at the plaque dedication and thanked the Dean.</w:t>
             </w:r>
           </w:p>
         </w:tc>
@@ -708,7 +708,7 @@
                 <w:sz w:val="19"/>
                 <w:szCs w:val="19"/>
               </w:rPr>
-              <w:t xml:space="preserve">Drove to Morrow and refused to be his only rope. Wants him, and set a limit. Works the Blue Plate and bakes; has a dream of her own she has not said aloud.</w:t>
+              <w:t xml:space="preserve">Drove to Morrow at dawn, baked Eleanor’s lemon cake with him (you followed the card), set her limit (“I can’t be your only rope”), read the napkin and said “Keep it,” then kissed him on the back steps. You promised to go to Tuesdays and Monday and to call Del before 3 a.m. Trust 10, Desire 6. She has a dream of her own she has not said aloud.</w:t>
             </w:r>
           </w:p>
         </w:tc>
@@ -771,7 +771,7 @@
                 <w:sz w:val="19"/>
                 <w:szCs w:val="19"/>
               </w:rPr>
-              <w:t xml:space="preserve">In the hospital on the third floor, aphasic, writing on balled-up paper. Recovering. Her unfinished sentence, “I LO—,” is the season’s ghost.</w:t>
+              <w:t xml:space="preserve">In the hospital on the third floor, aphasic, writing on balled-up paper. Recovering. You told her you loved her in the ambulance and never heard her answer. Trust 37, Desire 31, the highest of anyone. Her unfinished sentence (“I L—” on the napkin, “I LO—” on the photo strip Nora left) is the season’s ghost.</w:t>
             </w:r>
           </w:p>
         </w:tc>
@@ -834,7 +834,7 @@
                 <w:sz w:val="19"/>
                 <w:szCs w:val="19"/>
               </w:rPr>
-              <w:t xml:space="preserve">Will testify. Staying at Ashby on her own terms. Wants distance from Theo and has earned it. She and Wren were friends in a way Theo only just learned.</w:t>
+              <w:t xml:space="preserve">Will testify Thursday and is staying at Ashby on her own terms. You let her go when she left the envelope on your porch, which she noticed. Trust 7: respect, not warmth. She and Wren were friends in a way Theo only just learned, and her note says all she and Theo will be is “a witness and a witness.”</w:t>
             </w:r>
           </w:p>
         </w:tc>
@@ -1086,7 +1086,7 @@
                 <w:sz w:val="19"/>
                 <w:szCs w:val="19"/>
               </w:rPr>
-              <w:t xml:space="preserve">Dez runs the Gazette and the story. Coop is majoring in Sports Management and Vibes. Hunter is estranged from his father and from Tau.</w:t>
+              <w:t xml:space="preserve">Dez runs the Gazette and is Theo’s strongest friend after Wren (Trust 13). Coop is majoring in Sports Management and Vibes. Hunter is estranged from his father and from Tau (Trust −2 after the pin).</w:t>
             </w:r>
           </w:p>
         </w:tc>
@@ -1149,7 +1149,7 @@
                 <w:sz w:val="19"/>
                 <w:szCs w:val="19"/>
               </w:rPr>
-              <w:t xml:space="preserve">The Tuesday circle at the Blue Plate: the real community of the season.</w:t>
+              <w:t xml:space="preserve">The Tuesday circle at the Blue Plate: the real community of the season. Del’s Trust is 9 and she knows everything; Fenn is 6.</w:t>
             </w:r>
           </w:p>
         </w:tc>
@@ -4069,7 +4069,7 @@
           <w:sz w:val="22"/>
           <w:szCs w:val="22"/>
         </w:rPr>
-        <w:t xml:space="preserve">Season One’s Episode 8 canon will be read from the save once you finish it; anything flagged “pending” above will be adjusted.</w:t>
+        <w:t xml:space="preserve">Everything in section 4 is read directly from your Episode 8 save; nothing is pending.</w:t>
       </w:r>
     </w:p>
     <w:p>

</xml_diff>